<commit_message>
Fix final documentation page breaks
</commit_message>
<xml_diff>
--- a/docs/Eco-Matic-Final-Project-Documentation-Formatted.docx
+++ b/docs/Eco-Matic-Final-Project-Documentation-Formatted.docx
@@ -2,24 +2,19 @@
 <file path=docProps\app.xml><?xml version="1.0" encoding="utf-8"?>
 <Properties xmlns="http://schemas.openxmlformats.org/officeDocument/2006/extended-properties" xmlns:vt="http://schemas.openxmlformats.org/officeDocument/2006/docPropsVTypes">
   <Application>Microsoft Word</Application>
-  <DocSecurity>0</DocSecurity>
-  <ScaleCrop>false</ScaleCrop>
   <Company>Eco-Matic</Company>
-  <LinksUpToDate>false</LinksUpToDate>
-  <SharedDoc>false</SharedDoc>
-  <HyperlinksChanged>false</HyperlinksChanged>
   <AppVersion>16.0000</AppVersion>
 </Properties>
 </file>
 
 <file path=docProps\core.xml><?xml version="1.0" encoding="utf-8"?>
-<cp:coreProperties xmlns:cp="http://schemas.openxmlformats.org/package/2006/metadata/core-properties" xmlns:dc="http://purl.org/dc/elements/1.1/" xmlns:dcterms="http://purl.org/dc/terms/" xmlns:dcmitype="http://purl.org/dc/dcmitype/" xmlns:xsi="http://www.w3.org/2001/XMLSchema-instance">
+<cp:coreProperties xmlns:cp="http://schemas.openxmlformats.org/package/2006/metadata/core-properties" xmlns:dc="http://purl.org/dc/elements/1.1/" xmlns:dcterms="http://purl.org/dc/terms/" xmlns:xsi="http://www.w3.org/2001/XMLSchema-instance">
   <dc:title>Eco-Matic Final Project Documentation</dc:title>
   <dc:subject>WPF smart vending system with recycling credits and SDG 12 alignment</dc:subject>
   <dc:creator>Seani</dc:creator>
   <cp:lastModifiedBy>Seani</cp:lastModifiedBy>
-  <dcterms:created xsi:type="dcterms:W3CDTF">2026-05-09T14:56:40Z</dcterms:created>
-  <dcterms:modified xsi:type="dcterms:W3CDTF">2026-05-09T14:56:40Z</dcterms:modified>
+  <dcterms:created xsi:type="dcterms:W3CDTF">2026-05-09T15:56:38Z</dcterms:created>
+  <dcterms:modified xsi:type="dcterms:W3CDTF">2026-05-09T15:56:38Z</dcterms:modified>
 </cp:coreProperties>
 </file>
 
@@ -30,6 +25,8 @@
       <w:pPr>
         <w:pStyle w:val="Title"/>
         <w:jc w:val="center"/>
+        <w:keepNext/>
+        <w:keepLines/>
       </w:pPr>
       <w:r>
         <w:rPr>
@@ -43,6 +40,8 @@
     <w:p>
       <w:pPr>
         <w:pStyle w:val="Heading1"/>
+        <w:keepNext/>
+        <w:keepLines/>
       </w:pPr>
       <w:r>
         <w:rPr>
@@ -56,6 +55,8 @@
     <w:p>
       <w:pPr>
         <w:pStyle w:val="Heading2"/>
+        <w:keepNext/>
+        <w:keepLines/>
       </w:pPr>
       <w:r>
         <w:rPr>
@@ -89,6 +90,8 @@
     <w:p>
       <w:pPr>
         <w:pStyle w:val="Heading2"/>
+        <w:keepNext/>
+        <w:keepLines/>
       </w:pPr>
       <w:r>
         <w:rPr>
@@ -112,6 +115,8 @@
     <w:p>
       <w:pPr>
         <w:pStyle w:val="Heading2"/>
+        <w:keepNext/>
+        <w:keepLines/>
       </w:pPr>
       <w:r>
         <w:rPr>
@@ -326,6 +331,8 @@
     <w:p>
       <w:pPr>
         <w:pStyle w:val="Heading2"/>
+        <w:keepNext/>
+        <w:keepLines/>
       </w:pPr>
       <w:r>
         <w:rPr>
@@ -430,6 +437,8 @@
     <w:p>
       <w:pPr>
         <w:pStyle w:val="Heading2"/>
+        <w:keepNext/>
+        <w:keepLines/>
       </w:pPr>
       <w:r>
         <w:rPr>
@@ -588,6 +597,8 @@
     <w:p>
       <w:pPr>
         <w:pStyle w:val="Heading1"/>
+        <w:keepNext/>
+        <w:keepLines/>
       </w:pPr>
       <w:r>
         <w:rPr>
@@ -601,6 +612,8 @@
     <w:p>
       <w:pPr>
         <w:pStyle w:val="Heading2"/>
+        <w:keepNext/>
+        <w:keepLines/>
       </w:pPr>
       <w:r>
         <w:rPr>
@@ -711,6 +724,8 @@
     <w:p>
       <w:pPr>
         <w:pStyle w:val="Heading2"/>
+        <w:keepNext/>
+        <w:keepLines/>
       </w:pPr>
       <w:r>
         <w:rPr>
@@ -854,6 +869,8 @@
     <w:p>
       <w:pPr>
         <w:pStyle w:val="Heading2"/>
+        <w:keepNext/>
+        <w:keepLines/>
       </w:pPr>
       <w:r>
         <w:rPr>
@@ -1009,6 +1026,8 @@
     <w:p>
       <w:pPr>
         <w:pStyle w:val="Heading2"/>
+        <w:keepNext/>
+        <w:keepLines/>
       </w:pPr>
       <w:r>
         <w:rPr>
@@ -1085,8 +1104,15 @@
     </w:p>
     <w:p/>
     <w:p>
+      <w:r>
+        <w:br w:type="page"/>
+      </w:r>
+    </w:p>
+    <w:p>
       <w:pPr>
         <w:pStyle w:val="Heading1"/>
+        <w:keepNext/>
+        <w:keepLines/>
       </w:pPr>
       <w:r>
         <w:rPr>
@@ -1100,6 +1126,8 @@
     <w:p>
       <w:pPr>
         <w:pStyle w:val="Heading2"/>
+        <w:keepNext/>
+        <w:keepLines/>
       </w:pPr>
       <w:r>
         <w:rPr>
@@ -1326,6 +1354,8 @@
     <w:p>
       <w:pPr>
         <w:pStyle w:val="Heading2"/>
+        <w:keepNext/>
+        <w:keepLines/>
       </w:pPr>
       <w:r>
         <w:rPr>
@@ -1537,6 +1567,8 @@
     <w:p>
       <w:pPr>
         <w:pStyle w:val="Heading2"/>
+        <w:keepNext/>
+        <w:keepLines/>
       </w:pPr>
       <w:r>
         <w:rPr>
@@ -1657,6 +1689,8 @@
     <w:p>
       <w:pPr>
         <w:pStyle w:val="Heading2"/>
+        <w:keepNext/>
+        <w:keepLines/>
       </w:pPr>
       <w:r>
         <w:rPr>
@@ -1761,6 +1795,8 @@
     <w:p>
       <w:pPr>
         <w:pStyle w:val="Heading1"/>
+        <w:keepNext/>
+        <w:keepLines/>
       </w:pPr>
       <w:r>
         <w:rPr>
@@ -1774,6 +1810,8 @@
     <w:p>
       <w:pPr>
         <w:pStyle w:val="Heading2"/>
+        <w:keepNext/>
+        <w:keepLines/>
       </w:pPr>
       <w:r>
         <w:rPr>
@@ -1862,6 +1900,8 @@
     <w:p>
       <w:pPr>
         <w:pStyle w:val="Heading2"/>
+        <w:keepNext/>
+        <w:keepLines/>
       </w:pPr>
       <w:r>
         <w:rPr>
@@ -2100,6 +2140,8 @@
     <w:p>
       <w:pPr>
         <w:pStyle w:val="Heading2"/>
+        <w:keepNext/>
+        <w:keepLines/>
       </w:pPr>
       <w:r>
         <w:rPr>
@@ -2268,6 +2310,8 @@
     <w:p>
       <w:pPr>
         <w:pStyle w:val="Heading2"/>
+        <w:keepNext/>
+        <w:keepLines/>
       </w:pPr>
       <w:r>
         <w:rPr>
@@ -2396,8 +2440,15 @@
     </w:p>
     <w:p/>
     <w:p>
+      <w:r>
+        <w:br w:type="page"/>
+      </w:r>
+    </w:p>
+    <w:p>
       <w:pPr>
         <w:pStyle w:val="Heading1"/>
+        <w:keepNext/>
+        <w:keepLines/>
       </w:pPr>
       <w:r>
         <w:rPr>
@@ -2411,6 +2462,8 @@
     <w:p>
       <w:pPr>
         <w:pStyle w:val="Heading2"/>
+        <w:keepNext/>
+        <w:keepLines/>
       </w:pPr>
       <w:r>
         <w:rPr>
@@ -2599,6 +2652,8 @@
     <w:p>
       <w:pPr>
         <w:pStyle w:val="Heading2"/>
+        <w:keepNext/>
+        <w:keepLines/>
       </w:pPr>
       <w:r>
         <w:rPr>
@@ -2890,6 +2945,8 @@
     <w:p>
       <w:pPr>
         <w:pStyle w:val="Heading2"/>
+        <w:keepNext/>
+        <w:keepLines/>
       </w:pPr>
       <w:r>
         <w:rPr>
@@ -3058,6 +3115,8 @@
     <w:p>
       <w:pPr>
         <w:pStyle w:val="Heading1"/>
+        <w:keepNext/>
+        <w:keepLines/>
       </w:pPr>
       <w:r>
         <w:rPr>
@@ -3071,6 +3130,8 @@
     <w:p>
       <w:pPr>
         <w:pStyle w:val="Heading2"/>
+        <w:keepNext/>
+        <w:keepLines/>
       </w:pPr>
       <w:r>
         <w:rPr>
@@ -3213,6 +3274,8 @@
     <w:p>
       <w:pPr>
         <w:pStyle w:val="Heading2"/>
+        <w:keepNext/>
+        <w:keepLines/>
       </w:pPr>
       <w:r>
         <w:rPr>
@@ -3353,8 +3416,15 @@
     </w:p>
     <w:p/>
     <w:p>
+      <w:r>
+        <w:br w:type="page"/>
+      </w:r>
+    </w:p>
+    <w:p>
       <w:pPr>
         <w:pStyle w:val="Heading1"/>
+        <w:keepNext/>
+        <w:keepLines/>
       </w:pPr>
       <w:r>
         <w:rPr>
@@ -3368,6 +3438,8 @@
     <w:p>
       <w:pPr>
         <w:pStyle w:val="Heading2"/>
+        <w:keepNext/>
+        <w:keepLines/>
       </w:pPr>
       <w:r>
         <w:rPr>
@@ -3680,6 +3752,8 @@
     <w:p>
       <w:pPr>
         <w:pStyle w:val="Heading2"/>
+        <w:keepNext/>
+        <w:keepLines/>
       </w:pPr>
       <w:r>
         <w:rPr>
@@ -3816,6 +3890,8 @@
     <w:p>
       <w:pPr>
         <w:pStyle w:val="Heading2"/>
+        <w:keepNext/>
+        <w:keepLines/>
       </w:pPr>
       <w:r>
         <w:rPr>
@@ -3910,6 +3986,8 @@
     <w:p>
       <w:pPr>
         <w:pStyle w:val="Heading1"/>
+        <w:keepNext/>
+        <w:keepLines/>
       </w:pPr>
       <w:r>
         <w:rPr>
@@ -3923,6 +4001,8 @@
     <w:p>
       <w:pPr>
         <w:pStyle w:val="Heading2"/>
+        <w:keepNext/>
+        <w:keepLines/>
       </w:pPr>
       <w:r>
         <w:rPr>
@@ -4049,6 +4129,8 @@
     <w:p>
       <w:pPr>
         <w:pStyle w:val="Heading2"/>
+        <w:keepNext/>
+        <w:keepLines/>
       </w:pPr>
       <w:r>
         <w:rPr>
@@ -4141,8 +4223,15 @@
     </w:p>
     <w:p/>
     <w:p>
+      <w:r>
+        <w:br w:type="page"/>
+      </w:r>
+    </w:p>
+    <w:p>
       <w:pPr>
         <w:pStyle w:val="Heading1"/>
+        <w:keepNext/>
+        <w:keepLines/>
       </w:pPr>
       <w:r>
         <w:rPr>
@@ -4156,6 +4245,8 @@
     <w:p>
       <w:pPr>
         <w:pStyle w:val="Heading2"/>
+        <w:keepNext/>
+        <w:keepLines/>
       </w:pPr>
       <w:r>
         <w:rPr>
@@ -4179,6 +4270,8 @@
     <w:p>
       <w:pPr>
         <w:pStyle w:val="Heading2"/>
+        <w:keepNext/>
+        <w:keepLines/>
       </w:pPr>
       <w:r>
         <w:rPr>
@@ -4297,8 +4390,15 @@
     </w:p>
     <w:p/>
     <w:p>
+      <w:r>
+        <w:br w:type="page"/>
+      </w:r>
+    </w:p>
+    <w:p>
       <w:pPr>
         <w:pStyle w:val="Heading1"/>
+        <w:keepNext/>
+        <w:keepLines/>
       </w:pPr>
       <w:r>
         <w:rPr>
@@ -4312,6 +4412,8 @@
     <w:p>
       <w:pPr>
         <w:pStyle w:val="Heading2"/>
+        <w:keepNext/>
+        <w:keepLines/>
       </w:pPr>
       <w:r>
         <w:rPr>
@@ -4350,6 +4452,8 @@
     <w:p>
       <w:pPr>
         <w:pStyle w:val="Heading2"/>
+        <w:keepNext/>
+        <w:keepLines/>
       </w:pPr>
       <w:r>
         <w:rPr>
@@ -4524,6 +4628,8 @@
     <w:p>
       <w:pPr>
         <w:pStyle w:val="Heading2"/>
+        <w:keepNext/>
+        <w:keepLines/>
       </w:pPr>
       <w:r>
         <w:rPr>
@@ -4722,6 +4828,7 @@
     <w:pPr>
       <w:jc w:val="center"/>
       <w:spacing w:after="360"/>
+      <w:keepNext/>
     </w:pPr>
     <w:rPr>
       <w:rFonts w:ascii="Arial" w:hAnsi="Arial"/>
@@ -4737,6 +4844,7 @@
     <w:qFormat/>
     <w:pPr>
       <w:keepNext/>
+      <w:keepLines/>
       <w:spacing w:before="300" w:after="120"/>
     </w:pPr>
     <w:rPr>
@@ -4753,6 +4861,7 @@
     <w:qFormat/>
     <w:pPr>
       <w:keepNext/>
+      <w:keepLines/>
       <w:spacing w:before="180" w:after="80"/>
     </w:pPr>
     <w:rPr>

</xml_diff>